<commit_message>
add user-lock function and update docx
</commit_message>
<xml_diff>
--- a/docs/SCI_SE_4.Product-Backlog.docx
+++ b/docs/SCI_SE_4.Product-Backlog.docx
@@ -15909,23 +15909,38 @@
                 <w:rFonts w:eastAsiaTheme="majorEastAsia" w:cs="Times New Roman"/>
                 <w:szCs w:val="26"/>
               </w:rPr>
-              <w:t>Chọn người dùng cần xóa.</w:t>
-            </w:r>
-          </w:p>
-          <w:p>
-            <w:pPr>
-              <w:spacing w:line="360" w:lineRule="auto"/>
-              <w:rPr>
-                <w:rFonts w:eastAsiaTheme="majorEastAsia" w:cs="Times New Roman"/>
-                <w:szCs w:val="26"/>
-              </w:rPr>
-            </w:pPr>
+              <w:t xml:space="preserve">Chọn người dùng cần </w:t>
+            </w:r>
             <w:r>
               <w:rPr>
                 <w:rFonts w:eastAsiaTheme="majorEastAsia" w:cs="Times New Roman"/>
                 <w:szCs w:val="26"/>
                 <w:lang w:val="vi-VN"/>
               </w:rPr>
+              <w:t>khóa</w:t>
+            </w:r>
+            <w:r>
+              <w:rPr>
+                <w:rFonts w:eastAsiaTheme="majorEastAsia" w:cs="Times New Roman"/>
+                <w:szCs w:val="26"/>
+              </w:rPr>
+              <w:t>.</w:t>
+            </w:r>
+          </w:p>
+          <w:p>
+            <w:pPr>
+              <w:spacing w:line="360" w:lineRule="auto"/>
+              <w:rPr>
+                <w:rFonts w:eastAsiaTheme="majorEastAsia" w:cs="Times New Roman"/>
+                <w:szCs w:val="26"/>
+              </w:rPr>
+            </w:pPr>
+            <w:r>
+              <w:rPr>
+                <w:rFonts w:eastAsiaTheme="majorEastAsia" w:cs="Times New Roman"/>
+                <w:szCs w:val="26"/>
+                <w:lang w:val="vi-VN"/>
+              </w:rPr>
               <w:t xml:space="preserve">+ </w:t>
             </w:r>
             <w:r>
@@ -15933,23 +15948,39 @@
                 <w:rFonts w:eastAsiaTheme="majorEastAsia" w:cs="Times New Roman"/>
                 <w:szCs w:val="26"/>
               </w:rPr>
-              <w:t>Xác nhận thao tác xóa.</w:t>
-            </w:r>
-          </w:p>
-          <w:p>
-            <w:pPr>
-              <w:spacing w:line="360" w:lineRule="auto"/>
-              <w:rPr>
-                <w:rFonts w:eastAsiaTheme="majorEastAsia" w:cs="Times New Roman"/>
-                <w:szCs w:val="26"/>
-              </w:rPr>
-            </w:pPr>
+              <w:t xml:space="preserve">Xác nhận thao tác </w:t>
+            </w:r>
             <w:r>
               <w:rPr>
                 <w:rFonts w:eastAsiaTheme="majorEastAsia" w:cs="Times New Roman"/>
                 <w:szCs w:val="26"/>
                 <w:lang w:val="vi-VN"/>
               </w:rPr>
+              <w:t>khóa</w:t>
+            </w:r>
+            <w:r>
+              <w:rPr>
+                <w:rFonts w:eastAsiaTheme="majorEastAsia" w:cs="Times New Roman"/>
+                <w:szCs w:val="26"/>
+              </w:rPr>
+              <w:t>.</w:t>
+            </w:r>
+          </w:p>
+          <w:p>
+            <w:pPr>
+              <w:spacing w:line="360" w:lineRule="auto"/>
+              <w:rPr>
+                <w:rFonts w:eastAsiaTheme="majorEastAsia" w:cs="Times New Roman"/>
+                <w:szCs w:val="26"/>
+                <w:lang w:val="vi-VN"/>
+              </w:rPr>
+            </w:pPr>
+            <w:r>
+              <w:rPr>
+                <w:rFonts w:eastAsiaTheme="majorEastAsia" w:cs="Times New Roman"/>
+                <w:szCs w:val="26"/>
+                <w:lang w:val="vi-VN"/>
+              </w:rPr>
               <w:t xml:space="preserve">+ </w:t>
             </w:r>
             <w:r>
@@ -15957,23 +15988,55 @@
                 <w:rFonts w:eastAsiaTheme="majorEastAsia" w:cs="Times New Roman"/>
                 <w:szCs w:val="26"/>
               </w:rPr>
-              <w:t>Hệ thống xử lý xóa người dùng khỏi hệ thống.</w:t>
-            </w:r>
-          </w:p>
-          <w:p>
-            <w:pPr>
-              <w:spacing w:line="360" w:lineRule="auto"/>
-              <w:rPr>
-                <w:rFonts w:eastAsiaTheme="majorEastAsia" w:cs="Times New Roman"/>
-                <w:szCs w:val="26"/>
-              </w:rPr>
-            </w:pPr>
+              <w:t xml:space="preserve">Hệ thống xử lý </w:t>
+            </w:r>
             <w:r>
               <w:rPr>
                 <w:rFonts w:eastAsiaTheme="majorEastAsia" w:cs="Times New Roman"/>
                 <w:szCs w:val="26"/>
                 <w:lang w:val="vi-VN"/>
               </w:rPr>
+              <w:t xml:space="preserve">khóa </w:t>
+            </w:r>
+            <w:r>
+              <w:rPr>
+                <w:rFonts w:eastAsiaTheme="majorEastAsia" w:cs="Times New Roman"/>
+                <w:szCs w:val="26"/>
+              </w:rPr>
+              <w:t>ngườ</w:t>
+            </w:r>
+            <w:r>
+              <w:rPr>
+                <w:rFonts w:eastAsiaTheme="majorEastAsia" w:cs="Times New Roman"/>
+                <w:szCs w:val="26"/>
+              </w:rPr>
+              <w:t xml:space="preserve">i </w:t>
+            </w:r>
+            <w:r>
+              <w:rPr>
+                <w:rFonts w:eastAsiaTheme="majorEastAsia" w:cs="Times New Roman"/>
+                <w:szCs w:val="26"/>
+                <w:lang w:val="vi-VN"/>
+              </w:rPr>
+              <w:t>dùng.</w:t>
+            </w:r>
+            <w:bookmarkStart w:id="84" w:name="_GoBack"/>
+            <w:bookmarkEnd w:id="84"/>
+          </w:p>
+          <w:p>
+            <w:pPr>
+              <w:spacing w:line="360" w:lineRule="auto"/>
+              <w:rPr>
+                <w:rFonts w:eastAsiaTheme="majorEastAsia" w:cs="Times New Roman"/>
+                <w:szCs w:val="26"/>
+              </w:rPr>
+            </w:pPr>
+            <w:r>
+              <w:rPr>
+                <w:rFonts w:eastAsiaTheme="majorEastAsia" w:cs="Times New Roman"/>
+                <w:szCs w:val="26"/>
+                <w:lang w:val="vi-VN"/>
+              </w:rPr>
               <w:t xml:space="preserve">+ </w:t>
             </w:r>
             <w:r>
@@ -15981,7 +16044,22 @@
                 <w:rFonts w:eastAsiaTheme="majorEastAsia" w:cs="Times New Roman"/>
                 <w:szCs w:val="26"/>
               </w:rPr>
-              <w:t>Nếu thành công, hiển thị thông báo “Xóa thành công”.</w:t>
+              <w:t>Nếu thành công, hiển thị thông báo “</w:t>
+            </w:r>
+            <w:r>
+              <w:rPr>
+                <w:rFonts w:eastAsiaTheme="majorEastAsia" w:cs="Times New Roman"/>
+                <w:szCs w:val="26"/>
+                <w:lang w:val="vi-VN"/>
+              </w:rPr>
+              <w:t xml:space="preserve">Khóa </w:t>
+            </w:r>
+            <w:r>
+              <w:rPr>
+                <w:rFonts w:eastAsiaTheme="majorEastAsia" w:cs="Times New Roman"/>
+                <w:szCs w:val="26"/>
+              </w:rPr>
+              <w:t>thành công”.</w:t>
             </w:r>
           </w:p>
           <w:p>
@@ -16191,8 +16269,8 @@
         <w:keepNext w:val="0"/>
         <w:keepLines w:val="0"/>
       </w:pPr>
-      <w:bookmarkStart w:id="84" w:name="_Toc226224212"/>
-      <w:bookmarkStart w:id="85" w:name="_Toc226225201"/>
+      <w:bookmarkStart w:id="85" w:name="_Toc226224212"/>
+      <w:bookmarkStart w:id="86" w:name="_Toc226225201"/>
       <w:r>
         <w:t>2.1.1</w:t>
       </w:r>
@@ -16223,8 +16301,8 @@
         </w:rPr>
         <w:t>danh mục</w:t>
       </w:r>
-      <w:bookmarkEnd w:id="84"/>
       <w:bookmarkEnd w:id="85"/>
+      <w:bookmarkEnd w:id="86"/>
     </w:p>
     <w:tbl>
       <w:tblPr>
@@ -17108,8 +17186,8 @@
         <w:keepNext w:val="0"/>
         <w:keepLines w:val="0"/>
       </w:pPr>
-      <w:bookmarkStart w:id="86" w:name="_Toc226224215"/>
-      <w:bookmarkStart w:id="87" w:name="_Toc226225202"/>
+      <w:bookmarkStart w:id="87" w:name="_Toc226224215"/>
+      <w:bookmarkStart w:id="88" w:name="_Toc226225202"/>
       <w:r>
         <w:t>2.1</w:t>
       </w:r>
@@ -17137,8 +17215,8 @@
       <w:r>
         <w:t>sản phẩm</w:t>
       </w:r>
-      <w:bookmarkEnd w:id="86"/>
       <w:bookmarkEnd w:id="87"/>
+      <w:bookmarkEnd w:id="88"/>
     </w:p>
     <w:tbl>
       <w:tblPr>
@@ -18134,8 +18212,8 @@
         <w:keepNext w:val="0"/>
         <w:keepLines w:val="0"/>
       </w:pPr>
-      <w:bookmarkStart w:id="88" w:name="_Toc226224216"/>
-      <w:bookmarkStart w:id="89" w:name="_Toc226225203"/>
+      <w:bookmarkStart w:id="89" w:name="_Toc226224216"/>
+      <w:bookmarkStart w:id="90" w:name="_Toc226225203"/>
       <w:r>
         <w:t>2.1.1</w:t>
       </w:r>
@@ -18160,8 +18238,8 @@
       <w:r>
         <w:t>Quản lý đơn hàng</w:t>
       </w:r>
-      <w:bookmarkEnd w:id="88"/>
       <w:bookmarkEnd w:id="89"/>
+      <w:bookmarkEnd w:id="90"/>
     </w:p>
     <w:tbl>
       <w:tblPr>
@@ -19076,8 +19154,8 @@
         <w:keepNext w:val="0"/>
         <w:keepLines w:val="0"/>
       </w:pPr>
-      <w:bookmarkStart w:id="90" w:name="_Toc226224217"/>
-      <w:bookmarkStart w:id="91" w:name="_Toc226225204"/>
+      <w:bookmarkStart w:id="91" w:name="_Toc226224217"/>
+      <w:bookmarkStart w:id="92" w:name="_Toc226225204"/>
       <w:r>
         <w:t>2.1.1</w:t>
       </w:r>
@@ -19105,8 +19183,8 @@
         </w:rPr>
         <w:t>Quản lý voucher</w:t>
       </w:r>
-      <w:bookmarkEnd w:id="90"/>
       <w:bookmarkEnd w:id="91"/>
+      <w:bookmarkEnd w:id="92"/>
     </w:p>
     <w:tbl>
       <w:tblPr>
@@ -20010,8 +20088,8 @@
         <w:keepNext w:val="0"/>
         <w:keepLines w:val="0"/>
       </w:pPr>
-      <w:bookmarkStart w:id="92" w:name="_Toc226224223"/>
-      <w:bookmarkStart w:id="93" w:name="_Toc226225205"/>
+      <w:bookmarkStart w:id="93" w:name="_Toc226224223"/>
+      <w:bookmarkStart w:id="94" w:name="_Toc226225205"/>
       <w:r>
         <w:t>2.1.</w:t>
       </w:r>
@@ -20036,8 +20114,8 @@
       <w:r>
         <w:t>Báo cáo thống kê</w:t>
       </w:r>
-      <w:bookmarkEnd w:id="92"/>
       <w:bookmarkEnd w:id="93"/>
+      <w:bookmarkEnd w:id="94"/>
     </w:p>
     <w:tbl>
       <w:tblPr>
@@ -20725,8 +20803,8 @@
         <w:keepNext w:val="0"/>
         <w:keepLines w:val="0"/>
       </w:pPr>
-      <w:bookmarkStart w:id="94" w:name="_Toc226224226"/>
-      <w:bookmarkStart w:id="95" w:name="_Toc226225206"/>
+      <w:bookmarkStart w:id="95" w:name="_Toc226224226"/>
+      <w:bookmarkStart w:id="96" w:name="_Toc226225206"/>
       <w:r>
         <w:t>2.1</w:t>
       </w:r>
@@ -20757,8 +20835,8 @@
       <w:r>
         <w:t>Chatbot AI</w:t>
       </w:r>
-      <w:bookmarkEnd w:id="94"/>
       <w:bookmarkEnd w:id="95"/>
+      <w:bookmarkEnd w:id="96"/>
     </w:p>
     <w:tbl>
       <w:tblPr>
@@ -21497,8 +21575,8 @@
         <w:keepNext w:val="0"/>
         <w:keepLines w:val="0"/>
       </w:pPr>
-      <w:bookmarkStart w:id="96" w:name="_Toc226224232"/>
-      <w:bookmarkStart w:id="97" w:name="_Toc226225207"/>
+      <w:bookmarkStart w:id="97" w:name="_Toc226224232"/>
+      <w:bookmarkStart w:id="98" w:name="_Toc226225207"/>
       <w:r>
         <w:t>2.</w:t>
       </w:r>
@@ -21508,8 +21586,8 @@
       <w:r>
         <w:t>.Ưu tiên và ước tính</w:t>
       </w:r>
-      <w:bookmarkEnd w:id="96"/>
       <w:bookmarkEnd w:id="97"/>
+      <w:bookmarkEnd w:id="98"/>
     </w:p>
     <w:p>
       <w:pPr>
@@ -23456,8 +23534,8 @@
         <w:keepNext w:val="0"/>
         <w:keepLines w:val="0"/>
       </w:pPr>
-      <w:bookmarkStart w:id="98" w:name="_Toc226224233"/>
-      <w:bookmarkStart w:id="99" w:name="_Toc226225208"/>
+      <w:bookmarkStart w:id="99" w:name="_Toc226224233"/>
+      <w:bookmarkStart w:id="100" w:name="_Toc226225208"/>
       <w:r>
         <w:t>2.</w:t>
       </w:r>
@@ -23473,8 +23551,8 @@
       <w:r>
         <w:t>Chia theo từng Sprirnt</w:t>
       </w:r>
-      <w:bookmarkEnd w:id="98"/>
       <w:bookmarkEnd w:id="99"/>
+      <w:bookmarkEnd w:id="100"/>
     </w:p>
     <w:tbl>
       <w:tblPr>
@@ -23931,10 +24009,7 @@
         </w:tc>
       </w:tr>
     </w:tbl>
-    <w:p>
-      <w:bookmarkStart w:id="100" w:name="_GoBack"/>
-      <w:bookmarkEnd w:id="100"/>
-    </w:p>
+    <w:p/>
     <w:sectPr>
       <w:footerReference w:type="default" r:id="rId11"/>
       <w:pgSz w:w="12240" w:h="15840"/>
@@ -24007,7 +24082,7 @@
           <w:rPr>
             <w:noProof/>
           </w:rPr>
-          <w:t>28</w:t>
+          <w:t>20</w:t>
         </w:r>
         <w:r>
           <w:rPr>
@@ -30023,7 +30098,7 @@
 </file>
 
 <file path=customXml/itemProps1.xml><?xml version="1.0" encoding="utf-8"?>
-<ds:datastoreItem xmlns:ds="http://schemas.openxmlformats.org/officeDocument/2006/customXml" ds:itemID="{F6CEA275-6C89-4F1B-8AA4-EF47D5ED8213}">
+<ds:datastoreItem xmlns:ds="http://schemas.openxmlformats.org/officeDocument/2006/customXml" ds:itemID="{5132B390-4B25-48E7-9E12-1D3E1146F26A}">
   <ds:schemaRefs>
     <ds:schemaRef ds:uri="http://schemas.openxmlformats.org/officeDocument/2006/bibliography"/>
   </ds:schemaRefs>

</xml_diff>